<commit_message>
refactor: simplify to single-file Program.cs and update report
</commit_message>
<xml_diff>
--- a/docs/Отчет_ПР_10-11_Белоус.docx
+++ b/docs/Отчет_ПР_10-11_Белоус.docx
@@ -41,7 +41,7 @@
           <w:color w:val="000000"/>
           <w:sz w:val="24"/>
         </w:rPr>
-        <w:t xml:space="preserve"> закрепить практические навыки работы со средой разработки Visual Studio 2019/2022; освоить инструментальные средства отладки программных модулей (точки останова, условные точки останова, пошаговое выполнение, окна Autos, Locals, Watch, Immediate Window); научиться организовывать надежную обработку встроенных и пользовательских исключений в среде .NET на языке C#.</w:t>
+        <w:t xml:space="preserve"> закрепить практические навыки работы со средой разработки Visual Studio 2019; научиться использовать встроенные инструментальные средства для проведения эффективной отладки приложений (точки останова, условные точки останова, пошаговое выполнение, окна Autos, Locals, Watch, Immediate Window); освоить методику организации обработки исключительных ситуаций в C# с помощью защитных блоков try-catch-finally.</w:t>
       </w:r>
     </w:p>
     <w:p>
@@ -65,7 +65,7 @@
           <w:color w:val="000000"/>
           <w:sz w:val="24"/>
         </w:rPr>
-        <w:t xml:space="preserve"> персональный компьютер, среда программирования Microsoft Visual Studio, платформа .NET Framework 4.7.2 / C#.</w:t>
+        <w:t xml:space="preserve"> персональный компьютер, среда программирования Microsoft Visual Studio 2019 / C# (.NET Framework 4.7.2).</w:t>
       </w:r>
     </w:p>
     <w:p>
@@ -144,7 +144,7 @@
           <w:color w:val="000000"/>
           <w:sz w:val="24"/>
         </w:rPr>
-        <w:t>1. Разработать программный проект на языке C#, реализующий вычисление сложной функции с итерационным циклом (разложение в ряд Тейлора для e^x и sin(x), а также табулирование функции на отрезке с контролем области допустимых значений).</w:t>
+        <w:t>1. Разработать консольное приложение на языке C#, реализующее вычисление функции в итерационном цикле с контролем возможных ошибок (деление на ноль).</w:t>
       </w:r>
     </w:p>
     <w:p>
@@ -159,7 +159,7 @@
           <w:color w:val="000000"/>
           <w:sz w:val="24"/>
         </w:rPr>
-        <w:t>2. Выполнить комплексную отладку разработанного проекта всеми доступными средствами интегрированной среды разработки (Visual Studio).</w:t>
+        <w:t>2. Выполнить пошаговую отладку программы всеми доступными средствами среды Visual Studio.</w:t>
       </w:r>
     </w:p>
     <w:p>
@@ -174,7 +174,7 @@
           <w:color w:val="000000"/>
           <w:sz w:val="24"/>
         </w:rPr>
-        <w:t>3. Исследовать работу с точками останова (Breakpoints), включая условные точки останова (Conditional Breakpoints) и счетчик попаданий (Hit Count).</w:t>
+        <w:t>3. Установить точки останова (Breakpoints) и исследовать их параметры, включая условные точки останова (Conditional Breakpoints) и счетчик попаданий (Hit Count).</w:t>
       </w:r>
     </w:p>
     <w:p>
@@ -189,7 +189,7 @@
           <w:color w:val="000000"/>
           <w:sz w:val="24"/>
         </w:rPr>
-        <w:t>4. Провести мониторинг значений переменных с использованием окон Autos, Locals, Watch и DataTips.</w:t>
+        <w:t>4. Проанализировать изменение значений переменных программы с использованием окон Autos, Locals, Watch и всплывающих подсказок DataTips.</w:t>
       </w:r>
     </w:p>
     <w:p>
@@ -204,7 +204,7 @@
           <w:color w:val="000000"/>
           <w:sz w:val="24"/>
         </w:rPr>
-        <w:t>5. Опробовать изменение значения переменной «на лету» в процессе выполнения программы для моделирования различных сценариев.</w:t>
+        <w:t>5. Изменить значение переменной непосредственно во время сеанса отладки («на лету») через окно Watch / Immediate Window и отследить реакцию логики программы.</w:t>
       </w:r>
     </w:p>
     <w:p>
@@ -219,7 +219,7 @@
           <w:color w:val="000000"/>
           <w:sz w:val="24"/>
         </w:rPr>
-        <w:t>6. Организовать надежную обработку исключительных ситуаций (DivideByZeroException, ArgumentOutOfRangeException, пользовательский класс MathCalculationException) с помощью блоков try-catch-finally.</w:t>
+        <w:t>6. Организовать надежную обработку исключений (DivideByZeroException) с использованием блоков try-catch-finally.</w:t>
       </w:r>
     </w:p>
     <w:p>
@@ -250,7 +250,7 @@
           <w:color w:val="000000"/>
           <w:sz w:val="24"/>
         </w:rPr>
-        <w:t>В соответствии с заданием был разработан проект консольного приложения на платформе .NET Framework 4.7.2. Архитектура проекта включает в себя модули вычисления рядов Тейлора (TaylorSeriesCalculator), табулирования функции (FunctionTabulator), класс специализированного пользовательского исключения (MathCalculationException) и специализированный модуль отладки (DebuggerDemo).</w:t>
+        <w:t>В соответствии с методическими указаниями было разработано компактное консольное приложение в файле Program.cs. В качестве расчетной модели выбрана функция y = (x^2 + 4) / (x - 3), вычисляемая в цикле for (int i = 1; i &lt;= 5; i++). При x = 3 знаменатель обращается в ноль, что позволяет наглядно отработать как штатные вычисления, так и обработку исключительных ситуаций деления на ноль.</w:t>
       </w:r>
     </w:p>
     <w:p>
@@ -266,7 +266,7 @@
           <w:color w:val="000000"/>
           <w:sz w:val="24"/>
         </w:rPr>
-        <w:t xml:space="preserve">Пункт 1. </w:t>
+        <w:t xml:space="preserve">Пункт 1-2. </w:t>
       </w:r>
       <w:r>
         <w:rPr>
@@ -274,7 +274,7 @@
           <w:color w:val="000000"/>
           <w:sz w:val="24"/>
         </w:rPr>
-        <w:t>1. Разработка математического модуля и итерационных вычислений</w:t>
+        <w:t>1. Установка контрольных точек останова</w:t>
       </w:r>
     </w:p>
     <w:p>
@@ -289,46 +289,7 @@
           <w:color w:val="000000"/>
           <w:sz w:val="24"/>
         </w:rPr>
-        <w:t>Для реализации вычислительной части были выбраны алгоритмы разложения функции e^x в ряд Тейлора: e^x = 1 + x + x^2/2! + ... + x^n/n! с рекуррентным пересчетом текущего члена term_n = term_{n-1} * x / n, а также сложная функция f(x) = (sqrt(x + 4) * exp(x / 5)) / (x - 2) + ln(x + 5), имеющая разрыв и особые точки (x = 2 — деление на ноль; x &lt; -4 — выход из ОДЗ корня; x &lt;= -5 — нарушение ОДЗ логарифма).</w:t>
-      </w:r>
-    </w:p>
-    <w:p>
-      <w:pPr>
-        <w:spacing w:line="360" w:lineRule="auto" w:after="120"/>
-        <w:ind w:firstLine="850"/>
-        <w:jc w:val="both"/>
-      </w:pPr>
-      <w:r>
-        <w:rPr>
-          <w:rFonts w:ascii="Times New Roman" w:hAnsi="Times New Roman"/>
-          <w:b/>
-          <w:color w:val="000000"/>
-          <w:sz w:val="24"/>
-        </w:rPr>
-        <w:t xml:space="preserve">Пункт 2-4. </w:t>
-      </w:r>
-      <w:r>
-        <w:rPr>
-          <w:rFonts w:ascii="Times New Roman" w:hAnsi="Times New Roman"/>
-          <w:color w:val="000000"/>
-          <w:sz w:val="24"/>
-        </w:rPr>
-        <w:t>2. Установка контрольных точек и запуск отладки</w:t>
-      </w:r>
-    </w:p>
-    <w:p>
-      <w:pPr>
-        <w:spacing w:line="360" w:lineRule="auto" w:after="120"/>
-        <w:ind w:firstLine="850"/>
-        <w:jc w:val="both"/>
-      </w:pPr>
-      <w:r>
-        <w:rPr>
-          <w:rFonts w:ascii="Times New Roman" w:hAnsi="Times New Roman"/>
-          <w:color w:val="000000"/>
-          <w:sz w:val="24"/>
-        </w:rPr>
-        <w:t>В исходном коде программы были расставлены точки останова (клавиша F9 либо клик по левому полю редактора). При запуске приложения в режиме Debug (F5) выполнение автоматически приостанавливается на заданной строке, что позволяет инспектировать текущее состояние стека и оперативной памяти.</w:t>
+        <w:t>На строке вызова функции расчета double y = Calculate(i); была установлена точка останова (клавиша F9). При запуске проекта в режиме отладки (F5) выполнение автоматически приостановилось перед вычислением. Через меню Debug -&gt; Windows -&gt; Breakpoints открыто окно управления точками останова, где виден список контрольных точек, их состояние и число попаданий.</w:t>
       </w:r>
     </w:p>
     <w:p>
@@ -340,7 +301,7 @@
       <w:r>
         <w:drawing>
           <wp:inline xmlns:a="http://schemas.openxmlformats.org/drawingml/2006/main" xmlns:pic="http://schemas.openxmlformats.org/drawingml/2006/picture">
-            <wp:extent cx="5486400" cy="3401568"/>
+            <wp:extent cx="5394960" cy="3344875"/>
             <wp:docPr id="1" name="Picture 1"/>
             <wp:cNvGraphicFramePr>
               <a:graphicFrameLocks noChangeAspect="1"/>
@@ -361,7 +322,7 @@
                   <pic:spPr>
                     <a:xfrm>
                       <a:off x="0" y="0"/>
-                      <a:ext cx="5486400" cy="3401568"/>
+                      <a:ext cx="5394960" cy="3344875"/>
                     </a:xfrm>
                     <a:prstGeom prst="rect"/>
                   </pic:spPr>
@@ -385,7 +346,7 @@
           <w:color w:val="323232"/>
           <w:sz w:val="22"/>
         </w:rPr>
-        <w:t>Рис. 1. Установка точек останова в коде программы и окно управления точками останова (Breakpoints Window)</w:t>
+        <w:t>Рис. 1. Установка точек останова в коде программы и окно Breakpoints Window</w:t>
       </w:r>
     </w:p>
     <w:p>
@@ -409,7 +370,7 @@
           <w:color w:val="000000"/>
           <w:sz w:val="24"/>
         </w:rPr>
-        <w:t>3. Использование окон Autos, Locals и Watch</w:t>
+        <w:t>2. Инспектирование переменных в окнах Locals и Watch 1</w:t>
       </w:r>
     </w:p>
     <w:p>
@@ -424,7 +385,7 @@
           <w:color w:val="000000"/>
           <w:sz w:val="24"/>
         </w:rPr>
-        <w:t>При остановке выполнения программы в отладчике были активированы окна наблюдения: окно Autos (отображает переменные, используемые в текущей и предыдущей строках кода), Locals (содержит все локальные переменные текущего стекового кадра метода) и окно Watch 1, куда были добавлены пользовательские выражения: accumulator + term, Math.Pow(i, 2), i &lt;= totalIterations. Это позволило непрерывно отслеживать динамику сходимости итераций.</w:t>
+        <w:t>В момент паузы отладчика исследовано содержимое окон Locals и Watch 1. В окне Locals отображаются все текущие локальные переменные метода Main (счетчик цикла i, multiplier, y, sum). В окно Watch 1 вручную добавлены составные пользовательские выражения: y * multiplier, sum + y * multiplier, i &lt;= 5. Значения выражений автоматически вычисляются отладчиком на каждом шаге цикла.</w:t>
       </w:r>
     </w:p>
     <w:p>
@@ -436,7 +397,7 @@
       <w:r>
         <w:drawing>
           <wp:inline xmlns:a="http://schemas.openxmlformats.org/drawingml/2006/main" xmlns:pic="http://schemas.openxmlformats.org/drawingml/2006/picture">
-            <wp:extent cx="5486400" cy="3401568"/>
+            <wp:extent cx="5394960" cy="3344875"/>
             <wp:docPr id="2" name="Picture 2"/>
             <wp:cNvGraphicFramePr>
               <a:graphicFrameLocks noChangeAspect="1"/>
@@ -457,7 +418,7 @@
                   <pic:spPr>
                     <a:xfrm>
                       <a:off x="0" y="0"/>
-                      <a:ext cx="5486400" cy="3401568"/>
+                      <a:ext cx="5394960" cy="3344875"/>
                     </a:xfrm>
                     <a:prstGeom prst="rect"/>
                   </pic:spPr>
@@ -481,7 +442,7 @@
           <w:color w:val="323232"/>
           <w:sz w:val="22"/>
         </w:rPr>
-        <w:t>Рис. 2. Инспектирование локальных переменных и пользовательских выражений в окнах Locals и Watch 1</w:t>
+        <w:t>Рис. 2. Просмотр локальных переменных и контрольных выражений в окнах Locals и Watch 1</w:t>
       </w:r>
     </w:p>
     <w:p>
@@ -505,7 +466,7 @@
           <w:color w:val="000000"/>
           <w:sz w:val="24"/>
         </w:rPr>
-        <w:t>4. Пошаговая отладка и анализ стека вызовов</w:t>
+        <w:t>3. Пошаговое выполнение алгоритма (F10 / F11) и Call Stack</w:t>
       </w:r>
     </w:p>
     <w:p>
@@ -520,7 +481,7 @@
           <w:color w:val="000000"/>
           <w:sz w:val="24"/>
         </w:rPr>
-        <w:t>С помощью команд пошагового выполнения Step Over (F10) и Step Into (F11) проводилось пошаговое прохождение алгоритма вычисления ряда Тейлора. В окне Call Stack отображается текущая иерархия вызовов от метода Main() до внутренней процедуры CalculateExp(), а при наведении курсора на переменные всплывают интерактивные подсказки DataTips.</w:t>
+        <w:t>Отработаны команды пошаговой трассировки: Step Over (F10 — шаг без входа в метод) и Step Into (F11 — шаг с заходом внутрь метода Calculate). В окне Call Stack (Стек вызовов) отображается точная цепочка вызовов (Calculate -&gt; Main). При наведении курсора мыши на переменную x в редакторе кода отобразилась всплывающая подсказка DataTip со значением 2.0.</w:t>
       </w:r>
     </w:p>
     <w:p>
@@ -532,7 +493,7 @@
       <w:r>
         <w:drawing>
           <wp:inline xmlns:a="http://schemas.openxmlformats.org/drawingml/2006/main" xmlns:pic="http://schemas.openxmlformats.org/drawingml/2006/picture">
-            <wp:extent cx="5486400" cy="3401568"/>
+            <wp:extent cx="5394960" cy="3344875"/>
             <wp:docPr id="3" name="Picture 3"/>
             <wp:cNvGraphicFramePr>
               <a:graphicFrameLocks noChangeAspect="1"/>
@@ -553,7 +514,7 @@
                   <pic:spPr>
                     <a:xfrm>
                       <a:off x="0" y="0"/>
-                      <a:ext cx="5486400" cy="3401568"/>
+                      <a:ext cx="5394960" cy="3344875"/>
                     </a:xfrm>
                     <a:prstGeom prst="rect"/>
                   </pic:spPr>
@@ -577,7 +538,7 @@
           <w:color w:val="323232"/>
           <w:sz w:val="22"/>
         </w:rPr>
-        <w:t>Рис. 3. Пошаговое выполнение алгоритма (F10/F11), анализ стека вызовов и всплывающие подсказки DataTips</w:t>
+        <w:t>Рис. 3. Пошаговое выполнение метода (F11 Step Into), стек вызовов Call Stack и всплывающая подсказка DataTip</w:t>
       </w:r>
     </w:p>
     <w:p>
@@ -601,7 +562,7 @@
           <w:color w:val="000000"/>
           <w:sz w:val="24"/>
         </w:rPr>
-        <w:t>5. Модификация значений переменных «на лету»</w:t>
+        <w:t>4. Изменение значения переменной «на лету»</w:t>
       </w:r>
     </w:p>
     <w:p>
@@ -616,7 +577,7 @@
           <w:color w:val="000000"/>
           <w:sz w:val="24"/>
         </w:rPr>
-        <w:t>В процессе приостановки отладчика в модуле RunVariableMutationDemo значение переменной secretMultiplier было вручную изменено в окне Watch с 5 на 500, а также проверено через Immediate Window (команда secretMultiplier = 500). После продолжения выполнения (F5) программа пошла по альтернативной ветке условного оператора if (secretMultiplier &gt; 100), что подтвердило возможность оперативной подмены данных во время сеанса отладки.</w:t>
+        <w:t>В соответствии с пунктом 6 методички программа была приостановлена перед условным оператором if (multiplier &gt; 10). В окне Watch 1 значение переменной multiplier было вручную изменено с 2 на 20 (а также проверено в командной строке Immediate Window командой multiplier = 20). При продолжении выполнения (F5) программа успешно зашла в блок if, выведя сообщение об успешной модификации.</w:t>
       </w:r>
     </w:p>
     <w:p>
@@ -628,7 +589,7 @@
       <w:r>
         <w:drawing>
           <wp:inline xmlns:a="http://schemas.openxmlformats.org/drawingml/2006/main" xmlns:pic="http://schemas.openxmlformats.org/drawingml/2006/picture">
-            <wp:extent cx="5486400" cy="3401568"/>
+            <wp:extent cx="5394960" cy="3344875"/>
             <wp:docPr id="4" name="Picture 4"/>
             <wp:cNvGraphicFramePr>
               <a:graphicFrameLocks noChangeAspect="1"/>
@@ -649,7 +610,7 @@
                   <pic:spPr>
                     <a:xfrm>
                       <a:off x="0" y="0"/>
-                      <a:ext cx="5486400" cy="3401568"/>
+                      <a:ext cx="5394960" cy="3344875"/>
                     </a:xfrm>
                     <a:prstGeom prst="rect"/>
                   </pic:spPr>
@@ -673,7 +634,7 @@
           <w:color w:val="323232"/>
           <w:sz w:val="22"/>
         </w:rPr>
-        <w:t>Рис. 4. Изменение значения переменной secretMultiplier в окне Watch и командной строке Immediate Window</w:t>
+        <w:t>Рис. 4. Модификация переменной multiplier в окне Watch и через Immediate Window</w:t>
       </w:r>
     </w:p>
     <w:p>
@@ -697,7 +658,7 @@
           <w:color w:val="000000"/>
           <w:sz w:val="24"/>
         </w:rPr>
-        <w:t>6. Применение условных точек останова (Conditional Breakpoints)</w:t>
+        <w:t>5. Настройка условных точек останова (Conditional Breakpoint)</w:t>
       </w:r>
     </w:p>
     <w:p>
@@ -712,7 +673,7 @@
           <w:color w:val="000000"/>
           <w:sz w:val="24"/>
         </w:rPr>
-        <w:t>Для эффективной отладки циклов с большим количеством итераций были настроены параметры точки останова (Breakpoint Settings). Было задано условие: k == 7 || tempValue &gt; 50.0. Отладчик проигнорировал первые 6 итераций и остановил программу ровно в момент истинности условия, что существенно экономит время разработчика.</w:t>
+        <w:t>Для точки останова на строке 20 было задано условие: i == 3 || sum &lt; -10.0. Отладчик проигнорировал первые итерации и приостановил выполнение ровно в тот момент, когда условие стало истинным, что подтверждает высокую эффективность условных точек при анализе длительных циклов.</w:t>
       </w:r>
     </w:p>
     <w:p>
@@ -724,7 +685,7 @@
       <w:r>
         <w:drawing>
           <wp:inline xmlns:a="http://schemas.openxmlformats.org/drawingml/2006/main" xmlns:pic="http://schemas.openxmlformats.org/drawingml/2006/picture">
-            <wp:extent cx="5486400" cy="3401568"/>
+            <wp:extent cx="5394960" cy="3344875"/>
             <wp:docPr id="5" name="Picture 5"/>
             <wp:cNvGraphicFramePr>
               <a:graphicFrameLocks noChangeAspect="1"/>
@@ -745,7 +706,7 @@
                   <pic:spPr>
                     <a:xfrm>
                       <a:off x="0" y="0"/>
-                      <a:ext cx="5486400" cy="3401568"/>
+                      <a:ext cx="5394960" cy="3344875"/>
                     </a:xfrm>
                     <a:prstGeom prst="rect"/>
                   </pic:spPr>
@@ -769,7 +730,7 @@
           <w:color w:val="323232"/>
           <w:sz w:val="22"/>
         </w:rPr>
-        <w:t>Рис. 5. Настройка диалогового окна условной точки останова (Conditional Breakpoint) и счетчика попаданий</w:t>
+        <w:t>Рис. 5. Настройка параметров условной точки останова (Breakpoint Settings)</w:t>
       </w:r>
     </w:p>
     <w:p>
@@ -793,7 +754,7 @@
           <w:color w:val="000000"/>
           <w:sz w:val="24"/>
         </w:rPr>
-        <w:t>7. Организация обработки исключений</w:t>
+        <w:t>6. Организация обработки исключений (try-catch-finally)</w:t>
       </w:r>
     </w:p>
     <w:p>
@@ -808,7 +769,7 @@
           <w:color w:val="000000"/>
           <w:sz w:val="24"/>
         </w:rPr>
-        <w:t>Были смоделированы исключительные ситуации деления на ноль (DivideByZeroException) и нарушения границ математических функций с генерацией пользовательского исключения MathCalculationException. С помощью окна Exception Settings (Ctrl+Alt+E) выполнена настройка остановки отладчика непосредственно в месте генерации исключения throw до передачи управления в блок catch.</w:t>
+        <w:t>В методе Calculate при значении x = 3 генерируется исключение DivideByZeroException. С помощью окна Exception Settings (Ctrl+Alt+E) проверена настройка остановки отладчика при генерации сбоя. В методе Main исключение перехватывается блоком catch, а блок finally гарантированно выполняет финализацию блока вычислений без аварийного завершения процесса.</w:t>
       </w:r>
     </w:p>
     <w:p>
@@ -820,7 +781,7 @@
       <w:r>
         <w:drawing>
           <wp:inline xmlns:a="http://schemas.openxmlformats.org/drawingml/2006/main" xmlns:pic="http://schemas.openxmlformats.org/drawingml/2006/picture">
-            <wp:extent cx="5486400" cy="3401568"/>
+            <wp:extent cx="5394960" cy="3344875"/>
             <wp:docPr id="6" name="Picture 6"/>
             <wp:cNvGraphicFramePr>
               <a:graphicFrameLocks noChangeAspect="1"/>
@@ -841,7 +802,7 @@
                   <pic:spPr>
                     <a:xfrm>
                       <a:off x="0" y="0"/>
-                      <a:ext cx="5486400" cy="3401568"/>
+                      <a:ext cx="5394960" cy="3344875"/>
                     </a:xfrm>
                     <a:prstGeom prst="rect"/>
                   </pic:spPr>
@@ -865,7 +826,7 @@
           <w:color w:val="323232"/>
           <w:sz w:val="22"/>
         </w:rPr>
-        <w:t>Рис. 6. Окно Exception Helper и настройка прерывания по исключениям в Exception Settings</w:t>
+        <w:t>Рис. 6. Окно Exception Helper и настройка параметров исключений в Exception Settings</w:t>
       </w:r>
     </w:p>
     <w:p>
@@ -889,7 +850,7 @@
           <w:color w:val="000000"/>
           <w:sz w:val="24"/>
         </w:rPr>
-        <w:t>8. Консольный вывод и верификация расчетов</w:t>
+        <w:t>7. Проверка консольного вывода программы</w:t>
       </w:r>
     </w:p>
     <w:p>
@@ -904,7 +865,7 @@
           <w:color w:val="000000"/>
           <w:sz w:val="24"/>
         </w:rPr>
-        <w:t>Программа была протестирована в автоматическом режиме (--auto) и интерактивном режиме. Результаты табулирования функции и сходимости ряда Тейлора сопоставлены со стандартными значениями библиотеки System.Math, погрешность вычислений составила менее 10^-15.</w:t>
+        <w:t>Выполнена компиляция и запуск исполняемого файла 10-11.exe. Программа корректно рассчитала значения на допустимых шагах, перехватила деление на ноль на 3-м шаге и штатно завершила работу.</w:t>
       </w:r>
     </w:p>
     <w:p>
@@ -916,7 +877,7 @@
       <w:r>
         <w:drawing>
           <wp:inline xmlns:a="http://schemas.openxmlformats.org/drawingml/2006/main" xmlns:pic="http://schemas.openxmlformats.org/drawingml/2006/picture">
-            <wp:extent cx="5486400" cy="3580598"/>
+            <wp:extent cx="5394960" cy="3117088"/>
             <wp:docPr id="7" name="Picture 7"/>
             <wp:cNvGraphicFramePr>
               <a:graphicFrameLocks noChangeAspect="1"/>
@@ -937,7 +898,7 @@
                   <pic:spPr>
                     <a:xfrm>
                       <a:off x="0" y="0"/>
-                      <a:ext cx="5486400" cy="3580598"/>
+                      <a:ext cx="5394960" cy="3117088"/>
                     </a:xfrm>
                     <a:prstGeom prst="rect"/>
                   </pic:spPr>
@@ -961,7 +922,7 @@
           <w:color w:val="323232"/>
           <w:sz w:val="22"/>
         </w:rPr>
-        <w:t>Рис. 7. Результаты запуска приложения в консоли: расчет ряда Тейлора, таблица значений и перехват исключений</w:t>
+        <w:t>Рис. 7. Результаты выполнения программы в консоли</w:t>
       </w:r>
     </w:p>
     <w:p>
@@ -1001,7 +962,7 @@
           <w:color w:val="000000"/>
           <w:sz w:val="24"/>
         </w:rPr>
-        <w:t xml:space="preserve"> — это этап процесса разработки программного обеспечения, целью которого является обнаружение, локализация, исследование причин и исправление ошибок (дефектов, сбоев, некорректного поведения логики), приводящих к неправильной работе или аварийному завершению программы. В отличие от тестирования, констатирующего факт наличия ошибки («что работает неправильно»), отладка отвечает на вопрос «почему и где именно возник дефект в исходном коде» и завершается его устранением.</w:t>
+        <w:t xml:space="preserve"> — это процесс обнаружения, локализации, анализа причин и устранения дефектов (багов, синтаксических и логических ошибок), нарушающих правильную работу программы. В отличие от тестирования, которое лишь констатирует факт сбоя («что сломалось»), отладка выявляет конкретное место и первопричину в исходном коде («почему и где возникла ошибка») и устраняет её.</w:t>
       </w:r>
     </w:p>
     <w:p>
@@ -1025,19 +986,19 @@
           <w:color w:val="000000"/>
           <w:sz w:val="24"/>
         </w:rPr>
-        <w:t xml:space="preserve"> В арсенал современного разработчика (в частности в Microsoft Visual Studio) входят следующие инструментальные средства:</w:t>
+        <w:t xml:space="preserve"> В среде Microsoft Visual Studio используются следующие основные средства отладки:</w:t>
         <w:br/>
-        <w:t>а) Точки останова (Breakpoints): стандартные безусловные точки (F9), условные точки останова (Conditional Breakpoints) с логическими выражениями, точки с заданным числом проходов (Hit Count), точки трассировки (Tracepoints);</w:t>
+        <w:t>• Точки останова (Breakpoints): обычные (F9), условные (Conditional Breakpoints) и с фильтром по числу проходов (Hit Count);</w:t>
         <w:br/>
-        <w:t>б) Средства пошагового выполнения кода: Step Over (F10 — шаг без захода в вызываемые функции), Step Into (F11 — шаг с заходом внутрь функции), Step Out (Shift+F11 — выполнение до выхода из текущей функции), Run to Cursor (Ctrl+F10);</w:t>
+        <w:t>• Команды пошагового выполнения: Step Over (F10 — шаг с обходом), Step Into (F11 — шаг с заходом внутрь), Step Out (Shift+F11 — шаг с выходом);</w:t>
         <w:br/>
-        <w:t>в) Окна анализа переменных: Autos (автоматический список переменных), Locals (локальные переменные текущего контекста), Watch 1–4 (контрольные выражения с возможностью вычисления формул), QuickWatch (окно быстрого просмотра);</w:t>
+        <w:t>• Окна анализа переменных: Autos (автоматические), Locals (локальные переменные метода), Watch 1-4 (контрольные выражения);</w:t>
         <w:br/>
-        <w:t>г) Интерактивные редакторы: Immediate Window (окно немедленной оценки кода и исполнения операторов C# во время паузы), DataTips (всплывающие окна значений над переменными в редакторе);</w:t>
+        <w:t>• Интерактивные окна: Immediate Window (выполнение выражений во время паузы), DataTips (всплывающие подсказки);</w:t>
         <w:br/>
-        <w:t>д) Средства анализа вызовов и памяти: Call Stack (стек вызовов с указанием цепочки методов и номеров строк), Threads (список активных потоков приложения), Memory Window (просмотр физической памяти), Disassembly (дизассемблер);</w:t>
+        <w:t>• Окна диагностики стека и потоков: Call Stack (стек вызовов функций);</w:t>
         <w:br/>
-        <w:t>е) Инструменты управления исключениями: Exception Settings (окно настройки реакции на системные и пользовательские исключения CLR), Exception Helper (информационное окно об объекте исключения).</w:t>
+        <w:t>• Инструменты работы с исключениями: Exception Settings (Ctrl+Alt+E) и окно Exception Helper.</w:t>
       </w:r>
     </w:p>
     <w:p>
@@ -1061,19 +1022,19 @@
           <w:color w:val="000000"/>
           <w:sz w:val="24"/>
         </w:rPr>
-        <w:t xml:space="preserve"> В программной инженерии выделяют следующие ключевые методы и стратегии отладки:</w:t>
+        <w:t xml:space="preserve"> Основные методы отладки включают в себя:</w:t>
         <w:br/>
-        <w:t>а) Метод пошаговой отладки в отладчике (интерактивная отладка): использование точек останова, выполнение программы по инструкциям и контроль изменения внутреннего состояния переменных;</w:t>
+        <w:t>• Интерактивная отладка в IDE (Symbolic Debugging): использование точек останова, пошагового выполнения и инспектирования памяти;</w:t>
         <w:br/>
-        <w:t>б) Метод логирования и трассировки (Print Debugging): включение в критические участки программы вывода диагностических сообщений (Console.WriteLine, System.Diagnostics.Debug.WriteLine, NLog, Serilog) в консоль или лог-файлы для восстановления хронологии событий;</w:t>
+        <w:t>• Логирование и вывод сообщений (Print Debugging): вывод промежуточных значений через Console.WriteLine или лог-файлы;</w:t>
         <w:br/>
-        <w:t>в) Метод обратного прослеживания (дедукции / Backtracking): анализ начинается от точки обнаружения ошибки или сбоя вверх по потоку данных и стеку вызовов к месту возникновения первопричины дефекта;</w:t>
+        <w:t>• Метод обратного прослеживания (дедукции): движение от места проявления ошибки вверх по графу вызовов и переменным к ее источнику;</w:t>
         <w:br/>
-        <w:t>г) Метод индукции: выдвижение гипотез на основе систематизированных фактов и результатов тестов (поведение программы при валидных и невалидных входных данных) с последующей их экспериментальной проверкой;</w:t>
+        <w:t>• Метод индукции: выдвижение гипотез на основе сравнения условий, при которых ошибка воспроизводится и при которых не возникает;</w:t>
         <w:br/>
-        <w:t>д) Метод дихотомии (половинного деления): изоляция дефектного модуля путем последовательного деления подозрительного участка кода или истории версий (git bisect) пополам;</w:t>
+        <w:t>• Метод дихотомии (половинного деления): изоляция дефектного участка путем последовательного деления кода или истории правок пополам;</w:t>
         <w:br/>
-        <w:t>е) Метод граничных условий и провокационного тестирования: моделирование экстремальных ситуаций (деление на ноль, переполнение числовых типов, null-ссылки) для проверки корректности срабатывания защитных конструкций try-catch-finally.</w:t>
+        <w:t>• Стресс-тестирование граничных значений: проверка блоков try-catch при экстремальных и некорректных входных параметрах.</w:t>
       </w:r>
     </w:p>
     <w:p>
@@ -1113,7 +1074,7 @@
           <w:color w:val="000000"/>
           <w:sz w:val="24"/>
         </w:rPr>
-        <w:t>В ходе выполнения практической работы №10-11 были всесторонне закреплены практические навыки отладки программных модулей в среде Microsoft Visual Studio. На примере разработанной программы вычисления рядов Тейлора и табулирования функций были успешно освоены ключевые инструменты отладчика: установка безусловных и условных точек останова (Conditional Breakpoints), пошаговое прохождение алгоритма (F10, F11), мониторинг переменных через окна Autos, Locals и Watch, а также динамическая модификация значений переменных «на лету». Была практически реализована комплексная обработка исключений (включая собственное исключение MathCalculationException) с использованием защитных блоков try-catch-finally. Проведенные исследования подтверждают высокую эффективность встроенного инструментария Visual Studio для ускорения локализации дефектов и повышения надежности разрабатываемого программного обеспечения.</w:t>
+        <w:t>В процессе выполнения практической работы №10-11 были практически освоены и закреплены инструментальные средства отладки программных проектов в среде Visual Studio 2019. На примере простой программы с итерационным циклом и функцией с делением на ноль были на практике применены точки останова (F9), условные точки останова (Conditional Breakpoints), пошаговое выполнение алгоритма (F10, F11), просмотр и редактирование значений переменных «на лету» в окнах Locals, Watch и Immediate Window. Реализована корректная обработка исключений с помощью конструкции try-catch-finally, что позволило обеспечить надежность и отказоустойчивость приложения при возникновении математических ошибок.</w:t>
       </w:r>
     </w:p>
     <w:sectPr>

</xml_diff>

<commit_message>
refactor: simplify task 3 to basic division without complex formulas
</commit_message>
<xml_diff>
--- a/docs/Отчет_ПР_10-11_Белоус.docx
+++ b/docs/Отчет_ПР_10-11_Белоус.docx
@@ -41,7 +41,7 @@
           <w:color w:val="000000"/>
           <w:sz w:val="24"/>
         </w:rPr>
-        <w:t xml:space="preserve"> закрепить практические навыки работы со средой разработки Visual Studio 2019; научиться использовать встроенные инструментальные средства для проведения эффективной отладки приложений (точки останова, условные точки останова, пошаговое выполнение, окна Autos, Locals, Watch, Immediate Window); освоить методику организации обработки исключительных ситуаций в C# с помощью защитных блоков try-catch-finally.</w:t>
+        <w:t xml:space="preserve"> закрепить практические навыки работы со средой разработки Visual Studio 2019; научиться использовать инструментальные средства для эффективной отладки приложений (точки останова, условные точки останова, пошаговое выполнение, окна Autos, Locals, Watch, Immediate Window); освоить обработку исключительных ситуаций в C# с помощью защитных блоков try-catch-finally.</w:t>
       </w:r>
     </w:p>
     <w:p>
@@ -144,7 +144,7 @@
           <w:color w:val="000000"/>
           <w:sz w:val="24"/>
         </w:rPr>
-        <w:t>1. Разработать консольное приложение на языке C#, реализующее вычисление функции в итерационном цикле с контролем возможных ошибок (деление на ноль).</w:t>
+        <w:t>1. Разработать простое консольное приложение на языке C# без сложных громоздких формул, реализующее цикл накопления суммы с возможностью отслеживания переменных.</w:t>
       </w:r>
     </w:p>
     <w:p>
@@ -159,7 +159,7 @@
           <w:color w:val="000000"/>
           <w:sz w:val="24"/>
         </w:rPr>
-        <w:t>2. Выполнить пошаговую отладку программы всеми доступными средствами среды Visual Studio.</w:t>
+        <w:t>2. Выполнить пошаговую отладку программы средствами среды Visual Studio.</w:t>
       </w:r>
     </w:p>
     <w:p>
@@ -174,7 +174,7 @@
           <w:color w:val="000000"/>
           <w:sz w:val="24"/>
         </w:rPr>
-        <w:t>3. Установить точки останова (Breakpoints) и исследовать их параметры, включая условные точки останова (Conditional Breakpoints) и счетчик попаданий (Hit Count).</w:t>
+        <w:t>3. Установить точки останова (Breakpoints) и изучить их параметры (условные точки останова, счетчик проходов).</w:t>
       </w:r>
     </w:p>
     <w:p>
@@ -189,7 +189,7 @@
           <w:color w:val="000000"/>
           <w:sz w:val="24"/>
         </w:rPr>
-        <w:t>4. Проанализировать изменение значений переменных программы с использованием окон Autos, Locals, Watch и всплывающих подсказок DataTips.</w:t>
+        <w:t>4. Проанализировать изменение значений переменных программы с использованием окон Autos, Locals, Watch и подсказок DataTips.</w:t>
       </w:r>
     </w:p>
     <w:p>
@@ -204,7 +204,7 @@
           <w:color w:val="000000"/>
           <w:sz w:val="24"/>
         </w:rPr>
-        <w:t>5. Изменить значение переменной непосредственно во время сеанса отладки («на лету») через окно Watch / Immediate Window и отследить реакцию логики программы.</w:t>
+        <w:t>5. Изменить значение переменной непосредственно во время сеанса отладки («на лету») через окно Watch / Immediate Window.</w:t>
       </w:r>
     </w:p>
     <w:p>
@@ -219,7 +219,7 @@
           <w:color w:val="000000"/>
           <w:sz w:val="24"/>
         </w:rPr>
-        <w:t>6. Организовать надежную обработку исключений (DivideByZeroException) с использованием блоков try-catch-finally.</w:t>
+        <w:t>6. Реализовать простое задание на обработку исключения: прямое деление чисел a / b при нулевом делителе b = 0 с использованием защитной конструкции try-catch-finally.</w:t>
       </w:r>
     </w:p>
     <w:p>
@@ -250,7 +250,7 @@
           <w:color w:val="000000"/>
           <w:sz w:val="24"/>
         </w:rPr>
-        <w:t>В соответствии с методическими указаниями было разработано компактное консольное приложение в файле Program.cs. В качестве расчетной модели выбрана функция y = (x^2 + 4) / (x - 3), вычисляемая в цикле for (int i = 1; i &lt;= 5; i++). При x = 3 знаменатель обращается в ноль, что позволяет наглядно отработать как штатные вычисления, так и обработку исключительных ситуаций деления на ноль.</w:t>
+        <w:t>В соответствии с методическими указаниями было разработано простое и наглядное консольное приложение в файле Program.cs без использования сложных формул. Программа состоит из трех понятных блоков: цикла накопления суммы y = i * multiplier, блока проверки модификации переменной multiplier и блока прямого деления на ноль a / b в защищенном блоке try-catch-finally.</w:t>
       </w:r>
     </w:p>
     <w:p>
@@ -289,7 +289,7 @@
           <w:color w:val="000000"/>
           <w:sz w:val="24"/>
         </w:rPr>
-        <w:t>На строке вызова функции расчета double y = Calculate(i); была установлена точка останова (клавиша F9). При запуске проекта в режиме отладки (F5) выполнение автоматически приостановилось перед вычислением. Через меню Debug -&gt; Windows -&gt; Breakpoints открыто окно управления точками останова, где виден список контрольных точек, их состояние и число попаданий.</w:t>
+        <w:t>На строке int y = i * multiplier; была установлена точка останова (клавиша F9). При запуске проекта в режиме отладки (F5) выполнение автоматически приостановилось перед вычислением произведения. Через меню Debug -&gt; Windows -&gt; Breakpoints открыто окно управления точками останова со списком контрольных точек и числом попаданий.</w:t>
       </w:r>
     </w:p>
     <w:p>
@@ -385,7 +385,7 @@
           <w:color w:val="000000"/>
           <w:sz w:val="24"/>
         </w:rPr>
-        <w:t>В момент паузы отладчика исследовано содержимое окон Locals и Watch 1. В окне Locals отображаются все текущие локальные переменные метода Main (счетчик цикла i, multiplier, y, sum). В окно Watch 1 вручную добавлены составные пользовательские выражения: y * multiplier, sum + y * multiplier, i &lt;= 5. Значения выражений автоматически вычисляются отладчиком на каждом шаге цикла.</w:t>
+        <w:t>Во время приостановки выполнения исследованы значения в окнах Locals и Watch 1. В окне Locals отображаются переменные i, multiplier, y, sum. В окно Watch 1 добавлены контрольные выражения sum + y, i * multiplier, i &lt;= 5, значения которых автоматически пересчитываются отладчиком при каждом шаге цикла.</w:t>
       </w:r>
     </w:p>
     <w:p>
@@ -481,7 +481,7 @@
           <w:color w:val="000000"/>
           <w:sz w:val="24"/>
         </w:rPr>
-        <w:t>Отработаны команды пошаговой трассировки: Step Over (F10 — шаг без входа в метод) и Step Into (F11 — шаг с заходом внутрь метода Calculate). В окне Call Stack (Стек вызовов) отображается точная цепочка вызовов (Calculate -&gt; Main). При наведении курсора мыши на переменную x в редакторе кода отобразилась всплывающая подсказка DataTip со значением 2.0.</w:t>
+        <w:t>Отработаны команды пошаговой трассировки: Step Over (F10 — шаг с переходом к следующей строке) и Step Into (F11). В окне Call Stack (Стек вызовов) отображается текущий фрейм Program.Main, а при наведении курсора мыши на переменную y отображается всплывающая подсказка DataTip со значением 4.</w:t>
       </w:r>
     </w:p>
     <w:p>
@@ -538,7 +538,7 @@
           <w:color w:val="323232"/>
           <w:sz w:val="22"/>
         </w:rPr>
-        <w:t>Рис. 3. Пошаговое выполнение метода (F11 Step Into), стек вызовов Call Stack и всплывающая подсказка DataTip</w:t>
+        <w:t>Рис. 3. Пошаговое выполнение строк (F10 Step Over), стек вызовов Call Stack и всплывающая подсказка DataTip</w:t>
       </w:r>
     </w:p>
     <w:p>
@@ -577,7 +577,7 @@
           <w:color w:val="000000"/>
           <w:sz w:val="24"/>
         </w:rPr>
-        <w:t>В соответствии с пунктом 6 методички программа была приостановлена перед условным оператором if (multiplier &gt; 10). В окне Watch 1 значение переменной multiplier было вручную изменено с 2 на 20 (а также проверено в командной строке Immediate Window командой multiplier = 20). При продолжении выполнения (F5) программа успешно зашла в блок if, выведя сообщение об успешной модификации.</w:t>
+        <w:t>В соответствии с пунктом 6 методички программа была приостановлена перед условием if (multiplier &gt; 10). В окне Watch 1 значение переменной multiplier было вручную изменено с 2 на 20 (а также проверено в Immediate Window командой multiplier = 20). При продолжении выполнения (F5) программа пошла по ветви if, подтвердив успешную модификацию данных в памяти.</w:t>
       </w:r>
     </w:p>
     <w:p>
@@ -673,7 +673,7 @@
           <w:color w:val="000000"/>
           <w:sz w:val="24"/>
         </w:rPr>
-        <w:t>Для точки останова на строке 20 было задано условие: i == 3 || sum &lt; -10.0. Отладчик проигнорировал первые итерации и приостановил выполнение ровно в тот момент, когда условие стало истинным, что подтверждает высокую эффективность условных точек при анализе длительных циклов.</w:t>
+        <w:t>Для точки останова на строке 19 задано простое условие: i == 3 || sum &gt;= 6. Отладчик проигнорировал первые две итерации и остановил выполнение ровно на третьем шаге цикла, когда условие стало истинным.</w:t>
       </w:r>
     </w:p>
     <w:p>
@@ -746,7 +746,7 @@
           <w:color w:val="000000"/>
           <w:sz w:val="24"/>
         </w:rPr>
-        <w:t xml:space="preserve">Пункт 8. </w:t>
+        <w:t xml:space="preserve">Задание 3. </w:t>
       </w:r>
       <w:r>
         <w:rPr>
@@ -754,7 +754,7 @@
           <w:color w:val="000000"/>
           <w:sz w:val="24"/>
         </w:rPr>
-        <w:t>6. Организация обработки исключений (try-catch-finally)</w:t>
+        <w:t>6. Задание 3: Простая обработка исключения деления на ноль</w:t>
       </w:r>
     </w:p>
     <w:p>
@@ -769,7 +769,7 @@
           <w:color w:val="000000"/>
           <w:sz w:val="24"/>
         </w:rPr>
-        <w:t>В методе Calculate при значении x = 3 генерируется исключение DivideByZeroException. С помощью окна Exception Settings (Ctrl+Alt+E) проверена настройка остановки отладчика при генерации сбоя. В методе Main исключение перехватывается блоком catch, а блок finally гарантированно выполняет финализацию блока вычислений без аварийного завершения процесса.</w:t>
+        <w:t>В блоке задания 3 выполнена простая операция деления двух целочисленных переменных int result = a / b, где a = 10, b = 0. При попытке деления на ноль среда CLR возбуждает стандартное исключение DivideByZeroException. В окне Exception Helper отобразилось системное предупреждение, после чего управление корректно перешло в блок catch, а блок finally гарантированно завершил работу без сбоя программы.</w:t>
       </w:r>
     </w:p>
     <w:p>
@@ -826,7 +826,7 @@
           <w:color w:val="323232"/>
           <w:sz w:val="22"/>
         </w:rPr>
-        <w:t>Рис. 6. Окно Exception Helper и настройка параметров исключений в Exception Settings</w:t>
+        <w:t>Рис. 6. Окно Exception Helper при простом делении a / b на ноль и окно Exception Settings</w:t>
       </w:r>
     </w:p>
     <w:p>
@@ -865,7 +865,7 @@
           <w:color w:val="000000"/>
           <w:sz w:val="24"/>
         </w:rPr>
-        <w:t>Выполнена компиляция и запуск исполняемого файла 10-11.exe. Программа корректно рассчитала значения на допустимых шагах, перехватила деление на ноль на 3-м шаге и штатно завершила работу.</w:t>
+        <w:t>Выполнена сборка и запуск исполняемого файла 10-11.exe. Программа без сбоев выполнила все шаги цикла, вывела промежуточные суммы, обработала деление 10 на 0 и штатно завершилась.</w:t>
       </w:r>
     </w:p>
     <w:p>
@@ -988,7 +988,7 @@
         </w:rPr>
         <w:t xml:space="preserve"> В среде Microsoft Visual Studio используются следующие основные средства отладки:</w:t>
         <w:br/>
-        <w:t>• Точки останова (Breakpoints): обычные (F9), условные (Conditional Breakpoints) и с фильтром по числу проходов (Hit Count);</w:t>
+        <w:t>• Точки останова (Breakpoints): обычные (F9), условные (Conditional Breakpoints) и по счетчику проходов (Hit Count);</w:t>
         <w:br/>
         <w:t>• Команды пошагового выполнения: Step Over (F10 — шаг с обходом), Step Into (F11 — шаг с заходом внутрь), Step Out (Shift+F11 — шаг с выходом);</w:t>
         <w:br/>
@@ -1074,7 +1074,7 @@
           <w:color w:val="000000"/>
           <w:sz w:val="24"/>
         </w:rPr>
-        <w:t>В процессе выполнения практической работы №10-11 были практически освоены и закреплены инструментальные средства отладки программных проектов в среде Visual Studio 2019. На примере простой программы с итерационным циклом и функцией с делением на ноль были на практике применены точки останова (F9), условные точки останова (Conditional Breakpoints), пошаговое выполнение алгоритма (F10, F11), просмотр и редактирование значений переменных «на лету» в окнах Locals, Watch и Immediate Window. Реализована корректная обработка исключений с помощью конструкции try-catch-finally, что позволило обеспечить надежность и отказоустойчивость приложения при возникновении математических ошибок.</w:t>
+        <w:t>В процессе выполнения практической работы №10-11 были практически освоены и закреплены инструментальные средства отладки программных проектов в среде Visual Studio 2019. На примере простой программы без сложных формул были на практике применены точки останова (F9), условные точки останова (Conditional Breakpoints), пошаговое выполнение (F10, F11), просмотр и редактирование значений переменных «на лету» в окнах Locals, Watch и Immediate Window. В задании 3 успешно реализована простая обработка исключения деления на ноль (10 / 0) с помощью конструкции try-catch-finally, что обеспечило стабильную работу приложения без аварийных завершений.</w:t>
       </w:r>
     </w:p>
     <w:sectPr>

</xml_diff>